<commit_message>
README: credit co-leadership; correct proposal team-lead line
</commit_message>
<xml_diff>
--- a/docs/CS790_G3_Project_Proposal.docx
+++ b/docs/CS790_G3_Project_Proposal.docx
@@ -123,7 +123,7 @@
           <w:szCs w:val="20"/>
           <w:rtl w:val="0"/>
         </w:rPr>
-        <w:t xml:space="preserve">Team: Zulal Akarsu | Jai Sharma | Maria Martin</w:t>
+        <w:t>Team: Maria Martin | Zulal Akarsu | Jai Sharma</w:t>
       </w:r>
       <w:r>
         <w:rPr>
@@ -147,7 +147,7 @@
           <w:szCs w:val="20"/>
           <w:rtl w:val="0"/>
         </w:rPr>
-        <w:t xml:space="preserve">Team Leader: Zulal Akarsu</w:t>
+        <w:t>Team leads (equal): Maria Martin and Zulal Akarsu</w:t>
       </w:r>
       <w:r>
         <w:rPr>

</xml_diff>

<commit_message>
Present as a group project, no lead designation; put my name first across all documents
</commit_message>
<xml_diff>
--- a/docs/CS790_G3_Project_Proposal.docx
+++ b/docs/CS790_G3_Project_Proposal.docx
@@ -124,30 +124,6 @@
           <w:rtl w:val="0"/>
         </w:rPr>
         <w:t>Team: Maria Martin | Zulal Akarsu | Jai Sharma</w:t>
-      </w:r>
-      <w:r>
-        <w:rPr>
-          <w:rtl w:val="0"/>
-        </w:rPr>
-      </w:r>
-    </w:p>
-    <w:p>
-      <w:pPr>
-        <w:spacing w:after="60" w:line="276" w:lineRule="auto"/>
-        <w:jc w:val="center"/>
-        <w:rPr>
-          <w:rFonts w:ascii="Calibri" w:cs="Calibri" w:eastAsia="Calibri" w:hAnsi="Calibri"/>
-        </w:rPr>
-      </w:pPr>
-      <w:r>
-        <w:rPr>
-          <w:rFonts w:ascii="Calibri" w:cs="Calibri" w:eastAsia="Calibri" w:hAnsi="Calibri"/>
-          <w:color w:val="666666"/>
-          <w:sz w:val="20"/>
-          <w:szCs w:val="20"/>
-          <w:rtl w:val="0"/>
-        </w:rPr>
-        <w:t>Team leads (equal): Maria Martin and Zulal Akarsu</w:t>
       </w:r>
       <w:r>
         <w:rPr>
@@ -7941,7 +7917,7 @@
                 <w:szCs w:val="19"/>
                 <w:rtl w:val="0"/>
               </w:rPr>
-              <w:t xml:space="preserve">Lead Member</w:t>
+              <w:t>Member</w:t>
             </w:r>
             <w:r>
               <w:rPr>
@@ -7984,7 +7960,7 @@
                 <w:szCs w:val="19"/>
                 <w:rtl w:val="0"/>
               </w:rPr>
-              <w:t xml:space="preserve">Primary Role</w:t>
+              <w:t>Primary Role</w:t>
             </w:r>
             <w:r>
               <w:rPr>
@@ -8027,7 +8003,7 @@
                 <w:szCs w:val="19"/>
                 <w:rtl w:val="0"/>
               </w:rPr>
-              <w:t xml:space="preserve">Responsibilities</w:t>
+              <w:t>Responsibilities</w:t>
             </w:r>
             <w:r>
               <w:rPr>
@@ -8050,7 +8026,42 @@
               <w:bottom w:color="d0d0d0" w:space="0" w:sz="4" w:val="single"/>
               <w:right w:color="d0d0d0" w:space="0" w:sz="4" w:val="single"/>
             </w:tcBorders>
-            <w:shd w:fill="f5f7fa" w:val="clear"/>
+            <w:tcMar>
+              <w:top w:w="80.0" w:type="dxa"/>
+              <w:left w:w="120.0" w:type="dxa"/>
+              <w:bottom w:w="80.0" w:type="dxa"/>
+              <w:right w:w="120.0" w:type="dxa"/>
+            </w:tcMar>
+          </w:tcPr>
+          <w:p>
+            <w:pPr>
+              <w:spacing w:line="276" w:lineRule="auto"/>
+              <w:jc w:val="left"/>
+              <w:rPr>
+                <w:rFonts w:ascii="Calibri" w:cs="Calibri" w:eastAsia="Calibri" w:hAnsi="Calibri"/>
+                <w:b w:val="1"/>
+                <w:bCs w:val="1"/>
+              </w:rPr>
+            </w:pPr>
+            <w:r>
+              <w:rPr>
+                <w:rFonts w:ascii="Calibri" w:cs="Calibri" w:eastAsia="Calibri" w:hAnsi="Calibri"/>
+                <w:b w:val="1"/>
+                <w:bCs w:val="1"/>
+                <w:rtl w:val="0"/>
+              </w:rPr>
+              <w:t>Maria Martin</w:t>
+            </w:r>
+          </w:p>
+        </w:tc>
+        <w:tc>
+          <w:tcPr>
+            <w:tcBorders>
+              <w:top w:color="d0d0d0" w:space="0" w:sz="4" w:val="single"/>
+              <w:left w:color="d0d0d0" w:space="0" w:sz="4" w:val="single"/>
+              <w:bottom w:color="d0d0d0" w:space="0" w:sz="4" w:val="single"/>
+              <w:right w:color="d0d0d0" w:space="0" w:sz="4" w:val="single"/>
+            </w:tcBorders>
             <w:tcMar>
               <w:top w:w="80.0" w:type="dxa"/>
               <w:left w:w="120.0" w:type="dxa"/>
@@ -8075,24 +8086,23 @@
                 <w:szCs w:val="19"/>
                 <w:rtl w:val="0"/>
               </w:rPr>
-              <w:t xml:space="preserve">Jai Sharma</w:t>
-            </w:r>
-            <w:r>
-              <w:rPr>
-                <w:rtl w:val="0"/>
-              </w:rPr>
-            </w:r>
-          </w:p>
-        </w:tc>
-        <w:tc>
-          <w:tcPr>
-            <w:tcBorders>
-              <w:top w:color="d0d0d0" w:space="0" w:sz="4" w:val="single"/>
-              <w:left w:color="d0d0d0" w:space="0" w:sz="4" w:val="single"/>
-              <w:bottom w:color="d0d0d0" w:space="0" w:sz="4" w:val="single"/>
-              <w:right w:color="d0d0d0" w:space="0" w:sz="4" w:val="single"/>
-            </w:tcBorders>
-            <w:shd w:fill="f5f7fa" w:val="clear"/>
+              <w:t>Generative Model</w:t>
+            </w:r>
+            <w:r>
+              <w:rPr>
+                <w:rtl w:val="0"/>
+              </w:rPr>
+            </w:r>
+          </w:p>
+        </w:tc>
+        <w:tc>
+          <w:tcPr>
+            <w:tcBorders>
+              <w:top w:color="d0d0d0" w:space="0" w:sz="4" w:val="single"/>
+              <w:left w:color="d0d0d0" w:space="0" w:sz="4" w:val="single"/>
+              <w:bottom w:color="d0d0d0" w:space="0" w:sz="4" w:val="single"/>
+              <w:right w:color="d0d0d0" w:space="0" w:sz="4" w:val="single"/>
+            </w:tcBorders>
             <w:tcMar>
               <w:top w:w="80.0" w:type="dxa"/>
               <w:left w:w="120.0" w:type="dxa"/>
@@ -8111,53 +8121,11 @@
             <w:r>
               <w:rPr>
                 <w:rFonts w:ascii="Calibri" w:cs="Calibri" w:eastAsia="Calibri" w:hAnsi="Calibri"/>
-                <w:b w:val="1"/>
-                <w:bCs w:val="1"/>
                 <w:sz w:val="19"/>
                 <w:szCs w:val="19"/>
                 <w:rtl w:val="0"/>
               </w:rPr>
-              <w:t xml:space="preserve">Data + Baseline</w:t>
-            </w:r>
-            <w:r>
-              <w:rPr>
-                <w:rtl w:val="0"/>
-              </w:rPr>
-            </w:r>
-          </w:p>
-        </w:tc>
-        <w:tc>
-          <w:tcPr>
-            <w:tcBorders>
-              <w:top w:color="d0d0d0" w:space="0" w:sz="4" w:val="single"/>
-              <w:left w:color="d0d0d0" w:space="0" w:sz="4" w:val="single"/>
-              <w:bottom w:color="d0d0d0" w:space="0" w:sz="4" w:val="single"/>
-              <w:right w:color="d0d0d0" w:space="0" w:sz="4" w:val="single"/>
-            </w:tcBorders>
-            <w:shd w:fill="f5f7fa" w:val="clear"/>
-            <w:tcMar>
-              <w:top w:w="80.0" w:type="dxa"/>
-              <w:left w:w="120.0" w:type="dxa"/>
-              <w:bottom w:w="80.0" w:type="dxa"/>
-              <w:right w:w="120.0" w:type="dxa"/>
-            </w:tcMar>
-          </w:tcPr>
-          <w:p>
-            <w:pPr>
-              <w:spacing w:line="276" w:lineRule="auto"/>
-              <w:jc w:val="left"/>
-              <w:rPr>
-                <w:rFonts w:ascii="Calibri" w:cs="Calibri" w:eastAsia="Calibri" w:hAnsi="Calibri"/>
-              </w:rPr>
-            </w:pPr>
-            <w:r>
-              <w:rPr>
-                <w:rFonts w:ascii="Calibri" w:cs="Calibri" w:eastAsia="Calibri" w:hAnsi="Calibri"/>
-                <w:sz w:val="19"/>
-                <w:szCs w:val="19"/>
-                <w:rtl w:val="0"/>
-              </w:rPr>
-              <w:t xml:space="preserve">Data pipeline, preprocessing, CycleGAN baseline, integration</w:t>
+              <w:t>Primary generative architecture implementation and training</w:t>
             </w:r>
             <w:r>
               <w:rPr>
@@ -8180,42 +8148,7 @@
               <w:bottom w:color="d0d0d0" w:space="0" w:sz="4" w:val="single"/>
               <w:right w:color="d0d0d0" w:space="0" w:sz="4" w:val="single"/>
             </w:tcBorders>
-            <w:tcMar>
-              <w:top w:w="80.0" w:type="dxa"/>
-              <w:left w:w="120.0" w:type="dxa"/>
-              <w:bottom w:w="80.0" w:type="dxa"/>
-              <w:right w:w="120.0" w:type="dxa"/>
-            </w:tcMar>
-          </w:tcPr>
-          <w:p>
-            <w:pPr>
-              <w:spacing w:line="276" w:lineRule="auto"/>
-              <w:jc w:val="left"/>
-              <w:rPr>
-                <w:rFonts w:ascii="Calibri" w:cs="Calibri" w:eastAsia="Calibri" w:hAnsi="Calibri"/>
-                <w:b w:val="1"/>
-                <w:bCs w:val="1"/>
-              </w:rPr>
-            </w:pPr>
-            <w:r>
-              <w:rPr>
-                <w:rFonts w:ascii="Calibri" w:cs="Calibri" w:eastAsia="Calibri" w:hAnsi="Calibri"/>
-                <w:b w:val="1"/>
-                <w:bCs w:val="1"/>
-                <w:rtl w:val="0"/>
-              </w:rPr>
-              <w:t xml:space="preserve">Maria Martin</w:t>
-            </w:r>
-          </w:p>
-        </w:tc>
-        <w:tc>
-          <w:tcPr>
-            <w:tcBorders>
-              <w:top w:color="d0d0d0" w:space="0" w:sz="4" w:val="single"/>
-              <w:left w:color="d0d0d0" w:space="0" w:sz="4" w:val="single"/>
-              <w:bottom w:color="d0d0d0" w:space="0" w:sz="4" w:val="single"/>
-              <w:right w:color="d0d0d0" w:space="0" w:sz="4" w:val="single"/>
-            </w:tcBorders>
+            <w:shd w:fill="f5f7fa" w:val="clear"/>
             <w:tcMar>
               <w:top w:w="80.0" w:type="dxa"/>
               <w:left w:w="120.0" w:type="dxa"/>
@@ -8240,23 +8173,24 @@
                 <w:szCs w:val="19"/>
                 <w:rtl w:val="0"/>
               </w:rPr>
-              <w:t xml:space="preserve">Generative Model</w:t>
-            </w:r>
-            <w:r>
-              <w:rPr>
-                <w:rtl w:val="0"/>
-              </w:rPr>
-            </w:r>
-          </w:p>
-        </w:tc>
-        <w:tc>
-          <w:tcPr>
-            <w:tcBorders>
-              <w:top w:color="d0d0d0" w:space="0" w:sz="4" w:val="single"/>
-              <w:left w:color="d0d0d0" w:space="0" w:sz="4" w:val="single"/>
-              <w:bottom w:color="d0d0d0" w:space="0" w:sz="4" w:val="single"/>
-              <w:right w:color="d0d0d0" w:space="0" w:sz="4" w:val="single"/>
-            </w:tcBorders>
+              <w:t>Jai Sharma</w:t>
+            </w:r>
+            <w:r>
+              <w:rPr>
+                <w:rtl w:val="0"/>
+              </w:rPr>
+            </w:r>
+          </w:p>
+        </w:tc>
+        <w:tc>
+          <w:tcPr>
+            <w:tcBorders>
+              <w:top w:color="d0d0d0" w:space="0" w:sz="4" w:val="single"/>
+              <w:left w:color="d0d0d0" w:space="0" w:sz="4" w:val="single"/>
+              <w:bottom w:color="d0d0d0" w:space="0" w:sz="4" w:val="single"/>
+              <w:right w:color="d0d0d0" w:space="0" w:sz="4" w:val="single"/>
+            </w:tcBorders>
+            <w:shd w:fill="f5f7fa" w:val="clear"/>
             <w:tcMar>
               <w:top w:w="80.0" w:type="dxa"/>
               <w:left w:w="120.0" w:type="dxa"/>
@@ -8275,11 +8209,53 @@
             <w:r>
               <w:rPr>
                 <w:rFonts w:ascii="Calibri" w:cs="Calibri" w:eastAsia="Calibri" w:hAnsi="Calibri"/>
+                <w:b w:val="1"/>
+                <w:bCs w:val="1"/>
                 <w:sz w:val="19"/>
                 <w:szCs w:val="19"/>
                 <w:rtl w:val="0"/>
               </w:rPr>
-              <w:t xml:space="preserve">Primary generative architecture implementation and training</w:t>
+              <w:t>Data + Baseline</w:t>
+            </w:r>
+            <w:r>
+              <w:rPr>
+                <w:rtl w:val="0"/>
+              </w:rPr>
+            </w:r>
+          </w:p>
+        </w:tc>
+        <w:tc>
+          <w:tcPr>
+            <w:tcBorders>
+              <w:top w:color="d0d0d0" w:space="0" w:sz="4" w:val="single"/>
+              <w:left w:color="d0d0d0" w:space="0" w:sz="4" w:val="single"/>
+              <w:bottom w:color="d0d0d0" w:space="0" w:sz="4" w:val="single"/>
+              <w:right w:color="d0d0d0" w:space="0" w:sz="4" w:val="single"/>
+            </w:tcBorders>
+            <w:shd w:fill="f5f7fa" w:val="clear"/>
+            <w:tcMar>
+              <w:top w:w="80.0" w:type="dxa"/>
+              <w:left w:w="120.0" w:type="dxa"/>
+              <w:bottom w:w="80.0" w:type="dxa"/>
+              <w:right w:w="120.0" w:type="dxa"/>
+            </w:tcMar>
+          </w:tcPr>
+          <w:p>
+            <w:pPr>
+              <w:spacing w:line="276" w:lineRule="auto"/>
+              <w:jc w:val="left"/>
+              <w:rPr>
+                <w:rFonts w:ascii="Calibri" w:cs="Calibri" w:eastAsia="Calibri" w:hAnsi="Calibri"/>
+              </w:rPr>
+            </w:pPr>
+            <w:r>
+              <w:rPr>
+                <w:rFonts w:ascii="Calibri" w:cs="Calibri" w:eastAsia="Calibri" w:hAnsi="Calibri"/>
+                <w:sz w:val="19"/>
+                <w:szCs w:val="19"/>
+                <w:rtl w:val="0"/>
+              </w:rPr>
+              <w:t>Data pipeline, preprocessing, CycleGAN baseline, integration</w:t>
             </w:r>
             <w:r>
               <w:rPr>
@@ -8327,7 +8303,7 @@
                 <w:szCs w:val="19"/>
                 <w:rtl w:val="0"/>
               </w:rPr>
-              <w:t xml:space="preserve">Zulal Akarsu</w:t>
+              <w:t>Zulal Akarsu</w:t>
             </w:r>
             <w:r>
               <w:rPr>
@@ -8369,7 +8345,7 @@
                 <w:szCs w:val="19"/>
                 <w:rtl w:val="0"/>
               </w:rPr>
-              <w:t xml:space="preserve">Evaluation + Report</w:t>
+              <w:t>Evaluation + Report</w:t>
             </w:r>
             <w:r>
               <w:rPr>
@@ -8409,7 +8385,7 @@
                 <w:szCs w:val="19"/>
                 <w:rtl w:val="0"/>
               </w:rPr>
-              <w:t xml:space="preserve">Downstream classifier, FID evaluation, report lead, presentation</w:t>
+              <w:t>Downstream classifier, FID evaluation, report, presentation</w:t>
             </w:r>
             <w:r>
               <w:rPr>

</xml_diff>